<commit_message>
Preserve source DOCX body when rendering
Add a new rendering path that preserves the source document's OOXML body instead of reconstructing content from extracted text. Introduce render_preserving_source_document and many helper functions to unzip/zip .docx packages, parse/write XML via lxml, merge styles/numbering/content types, copy related media/parts, remap relationship IDs, normalize formatting, and apply accepted corrections. Wire generate_study_guide and run_generation_job to use the new renderer and adjust placeholder handling (remove_toc_placeholder) and paragraph clearing to retain pPr. Update validation to better detect missing source tables. Add tempfile/shutil/lxml imports and update the template .docx binary.
</commit_message>
<xml_diff>
--- a/app/templates/CQU_study_guide_template.docx
+++ b/app/templates/CQU_study_guide_template.docx
@@ -85,72 +85,6 @@
     <w:p>
       <w:r>
         <w:br w:type="page"/>
-      </w:r>
-    </w:p>
-    <w:p>
-      <w:pPr>
-        <w:pStyle w:val="TOCHeading"/>
-      </w:pPr>
-      <w:bookmarkStart w:id="0" w:name="_iniw3qpmtmph" w:colFirst="0" w:colLast="0"/>
-      <w:bookmarkEnd w:id="0"/>
-      <w:r>
-        <w:lastRenderedPageBreak/>
-        <w:t>CONTENTS</w:t>
-      </w:r>
-    </w:p>
-    <w:p>
-      <w:r>
-        <w:t>Generated documents should update this section using Word fields after rendering. In Word: right-click the table of contents area and select Update Field.</w:t>
-      </w:r>
-    </w:p>
-    <w:p>
-      <w:proofErr w:type="gramStart"/>
-      <w:r>
-        <w:rPr>
-          <w:rFonts w:ascii="Courier New" w:eastAsia="Courier New" w:hAnsi="Courier New"/>
-          <w:sz w:val="18"/>
-        </w:rPr>
-        <w:t xml:space="preserve">{{ </w:t>
-      </w:r>
-      <w:proofErr w:type="spellStart"/>
-      <w:r>
-        <w:rPr>
-          <w:rFonts w:ascii="Courier New" w:eastAsia="Courier New" w:hAnsi="Courier New"/>
-          <w:sz w:val="18"/>
-        </w:rPr>
-        <w:t>toc</w:t>
-      </w:r>
-      <w:proofErr w:type="gramEnd"/>
-      <w:r>
-        <w:rPr>
-          <w:rFonts w:ascii="Courier New" w:eastAsia="Courier New" w:hAnsi="Courier New"/>
-          <w:sz w:val="18"/>
-        </w:rPr>
-        <w:t>_</w:t>
-      </w:r>
-      <w:proofErr w:type="gramStart"/>
-      <w:r>
-        <w:rPr>
-          <w:rFonts w:ascii="Courier New" w:eastAsia="Courier New" w:hAnsi="Courier New"/>
-          <w:sz w:val="18"/>
-        </w:rPr>
-        <w:t>placeholder</w:t>
-      </w:r>
-      <w:proofErr w:type="spellEnd"/>
-      <w:r>
-        <w:rPr>
-          <w:rFonts w:ascii="Courier New" w:eastAsia="Courier New" w:hAnsi="Courier New"/>
-          <w:sz w:val="18"/>
-        </w:rPr>
-        <w:t xml:space="preserve"> }</w:t>
-      </w:r>
-      <w:proofErr w:type="gramEnd"/>
-      <w:r>
-        <w:rPr>
-          <w:rFonts w:ascii="Courier New" w:eastAsia="Courier New" w:hAnsi="Courier New"/>
-          <w:sz w:val="18"/>
-        </w:rPr>
-        <w:t>}</w:t>
       </w:r>
     </w:p>
     <w:p>
@@ -230,7 +164,6 @@
         <w:docPartUnique/>
       </w:docPartObj>
     </w:sdtPr>
-    <w:sdtEndPr/>
     <w:sdtContent>
       <w:sdt>
         <w:sdtPr>
@@ -240,7 +173,6 @@
             <w:docPartUnique/>
           </w:docPartObj>
         </w:sdtPr>
-        <w:sdtEndPr/>
         <w:sdtContent>
           <w:p>
             <w:pPr>
@@ -375,7 +307,6 @@
                   <w:id w:val="-1055770822"/>
                   <w:text/>
                 </w:sdtPr>
-                <w:sdtEndPr/>
                 <w:sdtContent>
                   <w:tc>
                     <w:tcPr>
@@ -793,7 +724,7 @@
             </wp:anchor>
           </w:drawing>
         </mc:Choice>
-        <mc:Fallback xmlns:arto="http://schemas.microsoft.com/office/word/2006/arto" xmlns:a14="http://schemas.microsoft.com/office/drawing/2010/main" xmlns:pic="http://schemas.openxmlformats.org/drawingml/2006/picture" xmlns:a="http://schemas.openxmlformats.org/drawingml/2006/main">
+        <mc:Fallback xmlns:a="http://schemas.openxmlformats.org/drawingml/2006/main" xmlns:pic="http://schemas.openxmlformats.org/drawingml/2006/picture" xmlns:a14="http://schemas.microsoft.com/office/drawing/2010/main" xmlns:arto="http://schemas.microsoft.com/office/word/2006/arto">
           <w:pict w14:anchorId="52C5629A">
             <v:line id="Straight Connector 1" style="position:absolute;z-index:251672579;visibility:visible;mso-wrap-style:square;mso-height-percent:0;mso-wrap-distance-left:9pt;mso-wrap-distance-top:0;mso-wrap-distance-right:9pt;mso-wrap-distance-bottom:0;mso-position-horizontal:absolute;mso-position-horizontal-relative:page;mso-position-vertical:absolute;mso-position-vertical-relative:page;mso-height-percent:0;mso-height-relative:margin" o:spid="_x0000_s1026" o:allowoverlap="f" strokecolor="#c7db5c" strokeweight=".5pt" from="297.35pt,38pt" to="297.35pt,741.8pt" w14:anchorId="57A98025" o:gfxdata="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">
               <v:stroke joinstyle="miter"/>
@@ -4900,14 +4831,7 @@
 </file>
 
 <file path=customXml/item1.xml><?xml version="1.0" encoding="utf-8"?>
-<p:properties xmlns:p="http://schemas.microsoft.com/office/2006/metadata/properties" xmlns:xsi="http://www.w3.org/2001/XMLSchema-instance" xmlns:pc="http://schemas.microsoft.com/office/infopath/2007/PartnerControls">
-  <documentManagement>
-    <TaxCatchAll xmlns="23a8e03a-f540-46c0-adeb-6c3d8fada3ab" xsi:nil="true"/>
-    <lcf76f155ced4ddcb4097134ff3c332f xmlns="294a9895-1d1d-4446-bf9d-6590381eaddb">
-      <Terms xmlns="http://schemas.microsoft.com/office/infopath/2007/PartnerControls"/>
-    </lcf76f155ced4ddcb4097134ff3c332f>
-  </documentManagement>
-</p:properties>
+<b:Sources xmlns:b="http://schemas.openxmlformats.org/officeDocument/2006/bibliography" xmlns="http://schemas.openxmlformats.org/officeDocument/2006/bibliography" SelectedStyle="\APASixthEditionOfficeOnline.xsl" StyleName="APA" Version="6"/>
 </file>
 
 <file path=customXml/item2.xml><?xml version="1.0" encoding="utf-8"?>
@@ -4920,7 +4844,14 @@
 </file>
 
 <file path=customXml/item3.xml><?xml version="1.0" encoding="utf-8"?>
-<b:Sources xmlns:b="http://schemas.openxmlformats.org/officeDocument/2006/bibliography" xmlns="http://schemas.openxmlformats.org/officeDocument/2006/bibliography" SelectedStyle="\APASixthEditionOfficeOnline.xsl" StyleName="APA" Version="6"/>
+<p:properties xmlns:p="http://schemas.microsoft.com/office/2006/metadata/properties" xmlns:xsi="http://www.w3.org/2001/XMLSchema-instance" xmlns:pc="http://schemas.microsoft.com/office/infopath/2007/PartnerControls">
+  <documentManagement>
+    <TaxCatchAll xmlns="23a8e03a-f540-46c0-adeb-6c3d8fada3ab" xsi:nil="true"/>
+    <lcf76f155ced4ddcb4097134ff3c332f xmlns="294a9895-1d1d-4446-bf9d-6590381eaddb">
+      <Terms xmlns="http://schemas.microsoft.com/office/infopath/2007/PartnerControls"/>
+    </lcf76f155ced4ddcb4097134ff3c332f>
+  </documentManagement>
+</p:properties>
 </file>
 
 <file path=customXml/item4.xml><?xml version="1.0" encoding="utf-8"?>
@@ -5165,12 +5096,9 @@
 </file>
 
 <file path=customXml/itemProps1.xml><?xml version="1.0" encoding="utf-8"?>
-<ds:datastoreItem xmlns:ds="http://schemas.openxmlformats.org/officeDocument/2006/customXml" ds:itemID="{1C5E38B7-0A1D-4ED7-9B60-E4916DEBA6D7}">
+<ds:datastoreItem xmlns:ds="http://schemas.openxmlformats.org/officeDocument/2006/customXml" ds:itemID="{47A32E93-B0EF-47D1-8D35-90CC1424A5E0}">
   <ds:schemaRefs>
-    <ds:schemaRef ds:uri="http://schemas.microsoft.com/office/2006/metadata/properties"/>
-    <ds:schemaRef ds:uri="http://schemas.microsoft.com/office/infopath/2007/PartnerControls"/>
-    <ds:schemaRef ds:uri="23a8e03a-f540-46c0-adeb-6c3d8fada3ab"/>
-    <ds:schemaRef ds:uri="294a9895-1d1d-4446-bf9d-6590381eaddb"/>
+    <ds:schemaRef ds:uri="http://schemas.openxmlformats.org/officeDocument/2006/bibliography"/>
   </ds:schemaRefs>
 </ds:datastoreItem>
 </file>
@@ -5184,9 +5112,12 @@
 </file>
 
 <file path=customXml/itemProps3.xml><?xml version="1.0" encoding="utf-8"?>
-<ds:datastoreItem xmlns:ds="http://schemas.openxmlformats.org/officeDocument/2006/customXml" ds:itemID="{47A32E93-B0EF-47D1-8D35-90CC1424A5E0}">
+<ds:datastoreItem xmlns:ds="http://schemas.openxmlformats.org/officeDocument/2006/customXml" ds:itemID="{1C5E38B7-0A1D-4ED7-9B60-E4916DEBA6D7}">
   <ds:schemaRefs>
-    <ds:schemaRef ds:uri="http://schemas.openxmlformats.org/officeDocument/2006/bibliography"/>
+    <ds:schemaRef ds:uri="http://schemas.microsoft.com/office/2006/metadata/properties"/>
+    <ds:schemaRef ds:uri="http://schemas.microsoft.com/office/infopath/2007/PartnerControls"/>
+    <ds:schemaRef ds:uri="23a8e03a-f540-46c0-adeb-6c3d8fada3ab"/>
+    <ds:schemaRef ds:uri="294a9895-1d1d-4446-bf9d-6590381eaddb"/>
   </ds:schemaRefs>
 </ds:datastoreItem>
 </file>

</xml_diff>